<commit_message>
Camera as a robotics core for the course and a roadmap to a paper
Explanation file:
- Section 8 now has two tiers. Course core: R1 calibrated workcell with
  ArUco, TF tree and RViz twin; R2 task-state perception fusing depth,
  hands and block markers; R3 robot gaze driven by the 3D hand point;
  R4 automatic measures with fluency metrics. Stretch: R5 attention,
  R6 intent prediction. Paper roadmap: P1 human-aware multi-robot
  turn-taking (recommended), P2 to P6.
- A system validation (calibration error, detection rate and latency,
  gaze error) joins the analysis plan and timeline.
- ROS 2 section adds the calibration, task-state and gaze nodes and a
  second research bag; ethics adds consent to anonymised reuse.

Form: the robot's eyes follow the participant's hand while an instruction
is open, and consent covers anonymised reuse. Still 5 pages.

Co-Authored-By: Claude Opus 5.5 <noreply@anthropic.com>
Claude-Session: https://claude.ai/code/session_012AWgD35ERW1oUqVeJypTz6
</commit_message>
<xml_diff>
--- a/HRI_ESP32_Study/HRI_Study_Design_ESP32_RobotHeads.docx
+++ b/HRI_ESP32_Study/HRI_Study_Design_ESP32_RobotHeads.docx
@@ -398,7 +398,7 @@
     </w:p>
     <w:p>
       <w:r>
-        <w:t>The independent variable is robot temporal coordination. Two small robot heads, ESP32 screens with animated faces on stands, sit to the left and right of the participant. Each robot gives its own instructions: it looks up at the participant and shows a colour (red or blue) and a number. When an overhead depth camera sees the matching block land in a bin, the robot glances at that bin and clears its instruction; after 6 seconds without it, the instruction is cleared and counted as missed. There are two conditions:</w:t>
+        <w:t>The independent variable is robot temporal coordination. Two robot heads (ESP32 screens with animated faces on stands) sit left and right of the participant. Each robot gives its own instructions: it looks up at the participant and shows a colour (red or blue) and a number. While an instruction is open, the robot's eyes follow the participant's hand. When an overhead depth camera sees the matching block land in a bin, the robot glances at that bin and clears its instruction; after 6 seconds without it, the instruction is cleared and counted as missed. There are two conditions:</w:t>
       </w:r>
     </w:p>
     <w:p>
@@ -432,7 +432,7 @@
         <w:t>Uncoordinated condition:</w:t>
       </w:r>
       <w:r>
-        <w:t xml:space="preserve"> The two robots act independently and never give an instruction at the same moment. Each robot still gives one instruction on average every 10 seconds, but its own gaps vary between 6 and 14 seconds, so instructions arrive at moments the participant cannot anticipate, and either robot may come next. The sequence is prepared in advance so that both conditions have the same 20 blocks and trial length.</w:t>
+        <w:t xml:space="preserve"> The two robots act independently and never give an instruction at the same moment. Each robot still gives one instruction on average every 10 seconds, but its own gaps vary between 6 and 14 seconds, so instructions arrive at unpredictable moments from either robot. The sequence is prepared in advance so both conditions have the same 20 blocks and trial length.</w:t>
       </w:r>
     </w:p>
     <w:p/>
@@ -740,7 +740,7 @@
     </w:p>
     <w:p>
       <w:r>
-        <w:t>An overhead Intel RealSense depth camera detects each block landing in a bin. The robots' instructions, these detections and the video are saved together in ROS 2 recordings (rosbags) on one clock. After each trial the experimenter checks the numbers in each bin and records the final running sum.</w:t>
+        <w:t>An overhead Intel RealSense depth camera detects each block landing in a bin. Instructions, detections and video are saved together in ROS 2 recordings (rosbags) on one clock. The experimenter checks the bins after each trial and records the final running sum.</w:t>
       </w:r>
     </w:p>
     <w:p/>
@@ -898,7 +898,7 @@
     </w:p>
     <w:p>
       <w:r>
-        <w:t>The participant stands at a workstation with a small robot head on each side, and a tray of numbered blocks and two coloured bins (red and blue) in front of them. An overhead depth camera records hands and blocks, not the face. The consent form, including consent to the video recording, is signed before the session starts. After a short briefing, the experimenter explains the task using the same instructions for every participant, and the robots greet the participant. The participant must sort the block of each instruction into the bin of the shown colour and keep a running mental total of the numbers. Sorting is described as the main task. We do not tell participants which condition we expect to be more demanding. Before data collection starts, they complete a 1-minute practice trial with 10 blocks.</w:t>
+        <w:t>The participant stands at a workstation with a small robot head on each side, and a tray of numbered blocks and two coloured bins (red and blue) in front of them. An overhead depth camera records hands and blocks, not the face. The consent form, including consent to the video recording and to anonymised reuse for research, is signed before the session starts. After a short briefing, the experimenter explains the task using the same instructions for every participant, and the robots greet the participant. The participant must sort the block of each instruction into the bin of the shown colour and keep a running mental total of the numbers. Sorting is described as the main task. We do not tell participants which condition we expect to be more demanding. Before data collection starts, they complete a 1-minute practice trial with 10 blocks.</w:t>
       </w:r>
     </w:p>
     <w:p/>

</xml_diff>